<commit_message>
Actualizar documento de SoftwareFactoryIII agregando nombre y apellido.
</commit_message>
<xml_diff>
--- a/SoftwareFactoryIII.docx
+++ b/SoftwareFactoryIII.docx
@@ -14,6 +14,18 @@
         <w:t>Gonzalo Bravo, Lautaro Ramos, Thiago Rivadineira.</w:t>
       </w:r>
     </w:p>
+    <w:p>
+      <w:pPr>
+        <w:pStyle w:val="Normal"/>
+        <w:bidi w:val="0"/>
+        <w:jc w:val="left"/>
+        <w:rPr/>
+      </w:pPr>
+      <w:r>
+        <w:rPr/>
+        <w:t>Julián Carola.</w:t>
+      </w:r>
+    </w:p>
     <w:sectPr>
       <w:type w:val="nextPage"/>
       <w:pgSz w:w="11906" w:h="16838"/>
@@ -21,6 +33,7 @@
       <w:pgNumType w:fmt="decimal"/>
       <w:formProt w:val="false"/>
       <w:textDirection w:val="lrTb"/>
+      <w:docGrid w:type="default" w:linePitch="100" w:charSpace="0"/>
     </w:sectPr>
   </w:body>
 </w:document>
@@ -40,7 +53,6 @@
     </w:rPrDefault>
     <w:pPrDefault>
       <w:pPr>
-        <w:widowControl/>
         <w:suppressAutoHyphens w:val="true"/>
       </w:pPr>
     </w:pPrDefault>
@@ -50,7 +62,10 @@
     <w:qFormat/>
     <w:pPr>
       <w:widowControl/>
+      <w:suppressAutoHyphens w:val="true"/>
       <w:bidi w:val="0"/>
+      <w:spacing w:before="0" w:after="0"/>
+      <w:jc w:val="left"/>
     </w:pPr>
     <w:rPr>
       <w:rFonts w:ascii="Liberation Serif" w:hAnsi="Liberation Serif" w:eastAsia="NSimSun" w:cs="Arial"/>
@@ -110,6 +125,32 @@
   </w:style>
   <w:style w:type="paragraph" w:styleId="ndice">
     <w:name w:val="Índice"/>
+    <w:basedOn w:val="Normal"/>
+    <w:qFormat/>
+    <w:pPr>
+      <w:suppressLineNumbers/>
+    </w:pPr>
+    <w:rPr>
+      <w:rFonts w:cs="Arial"/>
+    </w:rPr>
+  </w:style>
+  <w:style w:type="paragraph" w:styleId="Ttulouser">
+    <w:name w:val="Título (user)"/>
+    <w:basedOn w:val="Normal"/>
+    <w:next w:val="BodyText"/>
+    <w:qFormat/>
+    <w:pPr>
+      <w:keepNext w:val="true"/>
+      <w:spacing w:before="240" w:after="120"/>
+    </w:pPr>
+    <w:rPr>
+      <w:rFonts w:ascii="Liberation Sans" w:hAnsi="Liberation Sans" w:eastAsia="Microsoft YaHei" w:cs="Arial"/>
+      <w:sz w:val="28"/>
+      <w:szCs w:val="28"/>
+    </w:rPr>
+  </w:style>
+  <w:style w:type="paragraph" w:styleId="ndiceuser">
+    <w:name w:val="Índice (user)"/>
     <w:basedOn w:val="Normal"/>
     <w:qFormat/>
     <w:pPr>
@@ -130,37 +171,37 @@
         <a:srgbClr val="000000"/>
       </a:dk1>
       <a:lt1>
-        <a:srgbClr val="FFFFFF"/>
+        <a:srgbClr val="ffffff"/>
       </a:lt1>
       <a:dk2>
         <a:srgbClr val="000000"/>
       </a:dk2>
       <a:lt2>
-        <a:srgbClr val="FFFFFF"/>
+        <a:srgbClr val="ffffff"/>
       </a:lt2>
       <a:accent1>
-        <a:srgbClr val="18A303"/>
+        <a:srgbClr val="18a303"/>
       </a:accent1>
       <a:accent2>
-        <a:srgbClr val="0369A3"/>
+        <a:srgbClr val="0369a3"/>
       </a:accent2>
       <a:accent3>
-        <a:srgbClr val="A33E03"/>
+        <a:srgbClr val="a33e03"/>
       </a:accent3>
       <a:accent4>
-        <a:srgbClr val="8E03A3"/>
+        <a:srgbClr val="8e03a3"/>
       </a:accent4>
       <a:accent5>
-        <a:srgbClr val="C99C00"/>
+        <a:srgbClr val="c99c00"/>
       </a:accent5>
       <a:accent6>
-        <a:srgbClr val="C9211E"/>
+        <a:srgbClr val="c9211e"/>
       </a:accent6>
       <a:hlink>
-        <a:srgbClr val="0000EE"/>
+        <a:srgbClr val="0000ee"/>
       </a:hlink>
       <a:folHlink>
-        <a:srgbClr val="551A8B"/>
+        <a:srgbClr val="551a8b"/>
       </a:folHlink>
     </a:clrScheme>
     <a:fontScheme name="Office">

</xml_diff>